<commit_message>
Remove author name and student ID from report files
</commit_message>
<xml_diff>
--- a/第二十二組.doc.docx
+++ b/第二十二組.doc.docx
@@ -313,7 +313,6 @@
                 <w:rFonts w:hint="eastAsia"/>
                 <w:lang w:eastAsia="zh-TW"/>
               </w:rPr>
-              <w:t>蔡承</w:t>
             </w:r>
             <w:proofErr w:type="gramStart"/>
             <w:r>
@@ -321,7 +320,6 @@
                 <w:rFonts w:hint="eastAsia"/>
                 <w:lang w:eastAsia="zh-TW"/>
               </w:rPr>
-              <w:t>諺</w:t>
             </w:r>
             <w:proofErr w:type="gramEnd"/>
           </w:p>
@@ -342,7 +340,6 @@
               <w:rPr>
                 <w:sz w:val="26"/>
               </w:rPr>
-              <w:t>4</w:t>
             </w:r>
             <w:r>
               <w:rPr>
@@ -350,7 +347,6 @@
                 <w:sz w:val="26"/>
                 <w:lang w:eastAsia="zh-TW"/>
               </w:rPr>
-              <w:t>09651592</w:t>
             </w:r>
           </w:p>
         </w:tc>
@@ -36396,7 +36392,6 @@
                 <w:rFonts w:hint="eastAsia"/>
                 <w:lang w:eastAsia="zh-TW"/>
               </w:rPr>
-              <w:t>蔡承</w:t>
             </w:r>
             <w:proofErr w:type="gramStart"/>
             <w:r>
@@ -36404,7 +36399,6 @@
                 <w:rFonts w:hint="eastAsia"/>
                 <w:lang w:eastAsia="zh-TW"/>
               </w:rPr>
-              <w:t>諺</w:t>
             </w:r>
             <w:proofErr w:type="gramEnd"/>
           </w:p>
@@ -36426,7 +36420,6 @@
               <w:rPr>
                 <w:sz w:val="21"/>
               </w:rPr>
-              <w:t>4</w:t>
             </w:r>
             <w:r>
               <w:rPr>
@@ -36434,7 +36427,6 @@
                 <w:sz w:val="21"/>
                 <w:lang w:eastAsia="zh-TW"/>
               </w:rPr>
-              <w:t>09651592</w:t>
             </w:r>
           </w:p>
         </w:tc>

</xml_diff>